<commit_message>
Qualys ids note: dictionary entries referenced by table and column
The stored-length table pointed at sys_dictionary records by sys_id; one
of them (sn_sec_int_impl_config.value) is created when the Security
Integration Framework is installed and so differs per instance. Each row
now carries a name/element query that opens the same entry on any
instance, and the text says plainly that the figures are dictionary
entries, not property records.

Co-Authored-By: Claude Fable 5.1 <noreply@anthropic.com>
Claude-Session: https://claude.ai/code/session_01UaiSzs85tKmfaeLA1rAxsP
</commit_message>
<xml_diff>
--- a/stories/setStringParameter and the Qualys ids parameter.docx
+++ b/stories/setStringParameter and the Qualys ids parameter.docx
@@ -4,7 +4,7 @@
   <w:body>
     <w:p>
       <w:pPr>
-        <w:spacing w:after="20" w:before="0" w:line="228"/>
+        <w:spacing w:after="20" w:before="0" w:line="222"/>
       </w:pPr>
       <w:r>
         <w:rPr>
@@ -19,7 +19,7 @@
     </w:p>
     <w:p>
       <w:pPr>
-        <w:spacing w:after="40" w:before="0" w:line="228"/>
+        <w:spacing w:after="40" w:before="0" w:line="222"/>
       </w:pPr>
       <w:r>
         <w:rPr>
@@ -36,7 +36,7 @@
         <w:pBdr>
           <w:bottom w:val="single" w:color="C8CCD0" w:sz="4" w:space="2"/>
         </w:pBdr>
-        <w:spacing w:after="30" w:before="100" w:line="240"/>
+        <w:spacing w:after="24" w:before="80" w:line="236"/>
       </w:pPr>
       <w:r>
         <w:rPr>
@@ -56,7 +56,7 @@
           <w:ilvl w:val="0"/>
           <w:numId w:val="2"/>
         </w:numPr>
-        <w:spacing w:after="24" w:line="228"/>
+        <w:spacing w:after="20" w:line="222"/>
       </w:pPr>
       <w:r>
         <w:rPr>
@@ -114,7 +114,7 @@
           <w:ilvl w:val="0"/>
           <w:numId w:val="2"/>
         </w:numPr>
-        <w:spacing w:after="24" w:line="228"/>
+        <w:spacing w:after="20" w:line="222"/>
       </w:pPr>
       <w:r>
         <w:rPr>
@@ -148,7 +148,7 @@
           <w:ilvl w:val="0"/>
           <w:numId w:val="2"/>
         </w:numPr>
-        <w:spacing w:after="24" w:line="228"/>
+        <w:spacing w:after="20" w:line="222"/>
       </w:pPr>
       <w:r>
         <w:rPr>
@@ -212,7 +212,7 @@
         <w:pBdr>
           <w:bottom w:val="single" w:color="C8CCD0" w:sz="4" w:space="2"/>
         </w:pBdr>
-        <w:spacing w:after="30" w:before="100" w:line="240"/>
+        <w:spacing w:after="24" w:before="80" w:line="236"/>
       </w:pPr>
       <w:r>
         <w:rPr>
@@ -232,7 +232,7 @@
           <w:ilvl w:val="0"/>
           <w:numId w:val="2"/>
         </w:numPr>
-        <w:spacing w:after="24" w:line="228"/>
+        <w:spacing w:after="20" w:line="222"/>
       </w:pPr>
       <w:r>
         <w:rPr>
@@ -250,7 +250,7 @@
           <w:ilvl w:val="0"/>
           <w:numId w:val="2"/>
         </w:numPr>
-        <w:spacing w:after="24" w:line="228"/>
+        <w:spacing w:after="20" w:line="222"/>
       </w:pPr>
       <w:r>
         <w:rPr>
@@ -358,7 +358,7 @@
           <w:ilvl w:val="0"/>
           <w:numId w:val="2"/>
         </w:numPr>
-        <w:spacing w:after="24" w:line="228"/>
+        <w:spacing w:after="20" w:line="222"/>
       </w:pPr>
       <w:r>
         <w:rPr>
@@ -376,7 +376,7 @@
           <w:ilvl w:val="0"/>
           <w:numId w:val="2"/>
         </w:numPr>
-        <w:spacing w:after="24" w:line="228"/>
+        <w:spacing w:after="20" w:line="222"/>
       </w:pPr>
       <w:r>
         <w:rPr>
@@ -394,7 +394,7 @@
           <w:ilvl w:val="0"/>
           <w:numId w:val="2"/>
         </w:numPr>
-        <w:spacing w:after="24" w:line="228"/>
+        <w:spacing w:after="20" w:line="222"/>
       </w:pPr>
       <w:r>
         <w:rPr>
@@ -474,7 +474,7 @@
         <w:pBdr>
           <w:bottom w:val="single" w:color="C8CCD0" w:sz="4" w:space="2"/>
         </w:pBdr>
-        <w:spacing w:after="30" w:before="100" w:line="240"/>
+        <w:spacing w:after="24" w:before="80" w:line="236"/>
       </w:pPr>
       <w:r>
         <w:rPr>
@@ -494,9 +494,9 @@
           <w:ilvl w:val="0"/>
           <w:numId w:val="2"/>
         </w:numPr>
-        <w:spacing w:after="24" w:line="228"/>
-      </w:pPr>
-      <w:hyperlink w:history="1" r:id="rIdbhr_fp-wna-2jtjuvf_f7">
+        <w:spacing w:after="20" w:line="222"/>
+      </w:pPr>
+      <w:hyperlink w:history="1" r:id="rIdw7hnt6jqxatxf0hp-jd4k">
         <w:r>
           <w:rPr>
             <w:rFonts w:ascii="Arial" w:cs="Arial" w:eastAsia="Arial" w:hAnsi="Arial"/>
@@ -525,9 +525,9 @@
           <w:ilvl w:val="0"/>
           <w:numId w:val="2"/>
         </w:numPr>
-        <w:spacing w:after="24" w:line="228"/>
-      </w:pPr>
-      <w:hyperlink w:history="1" r:id="rId5g3e5xg3ciz3fbgyga6wf">
+        <w:spacing w:after="20" w:line="222"/>
+      </w:pPr>
+      <w:hyperlink w:history="1" r:id="rIdzpqn_cjubmtfsojdrbffe">
         <w:r>
           <w:rPr>
             <w:rFonts w:ascii="Arial" w:cs="Arial" w:eastAsia="Arial" w:hAnsi="Arial"/>
@@ -556,9 +556,9 @@
           <w:ilvl w:val="0"/>
           <w:numId w:val="2"/>
         </w:numPr>
-        <w:spacing w:after="24" w:line="228"/>
-      </w:pPr>
-      <w:hyperlink w:history="1" r:id="rIdxtpvua4fww4sxaigcox4r">
+        <w:spacing w:after="20" w:line="222"/>
+      </w:pPr>
+      <w:hyperlink w:history="1" r:id="rIdwj7oj4nrgsdnjif6xb1sf">
         <w:r>
           <w:rPr>
             <w:rFonts w:ascii="Arial" w:cs="Arial" w:eastAsia="Arial" w:hAnsi="Arial"/>
@@ -587,9 +587,9 @@
           <w:ilvl w:val="0"/>
           <w:numId w:val="2"/>
         </w:numPr>
-        <w:spacing w:after="24" w:line="228"/>
-      </w:pPr>
-      <w:hyperlink w:history="1" r:id="rIdmjzfp1jpitdnzatq3jlkx">
+        <w:spacing w:after="20" w:line="222"/>
+      </w:pPr>
+      <w:hyperlink w:history="1" r:id="rIdpcjm0w_ms28qhzg8aoo1d">
         <w:r>
           <w:rPr>
             <w:rFonts w:ascii="Arial" w:cs="Arial" w:eastAsia="Arial" w:hAnsi="Arial"/>
@@ -618,9 +618,9 @@
           <w:ilvl w:val="0"/>
           <w:numId w:val="2"/>
         </w:numPr>
-        <w:spacing w:after="24" w:line="228"/>
-      </w:pPr>
-      <w:hyperlink w:history="1" r:id="rIdziqx0doodfncsgom0ecqg">
+        <w:spacing w:after="20" w:line="222"/>
+      </w:pPr>
+      <w:hyperlink w:history="1" r:id="rIdbmnw6fcp0_jsoprx3eunn">
         <w:r>
           <w:rPr>
             <w:rFonts w:ascii="Arial" w:cs="Arial" w:eastAsia="Arial" w:hAnsi="Arial"/>
@@ -649,9 +649,9 @@
           <w:ilvl w:val="0"/>
           <w:numId w:val="2"/>
         </w:numPr>
-        <w:spacing w:after="24" w:line="228"/>
-      </w:pPr>
-      <w:hyperlink w:history="1" r:id="rIdu1xvvymguarm7nzf99gj-">
+        <w:spacing w:after="20" w:line="222"/>
+      </w:pPr>
+      <w:hyperlink w:history="1" r:id="rIdlrdnhkalsyr9gvprzcaad">
         <w:r>
           <w:rPr>
             <w:rFonts w:ascii="Arial" w:cs="Arial" w:eastAsia="Arial" w:hAnsi="Arial"/>
@@ -680,9 +680,9 @@
           <w:ilvl w:val="0"/>
           <w:numId w:val="2"/>
         </w:numPr>
-        <w:spacing w:after="24" w:line="228"/>
-      </w:pPr>
-      <w:hyperlink w:history="1" r:id="rIdx9oxxxmjduff57lsxlv5w">
+        <w:spacing w:after="20" w:line="222"/>
+      </w:pPr>
+      <w:hyperlink w:history="1" r:id="rId13u3dozuwetehq3pqotet">
         <w:r>
           <w:rPr>
             <w:rFonts w:ascii="Arial" w:cs="Arial" w:eastAsia="Arial" w:hAnsi="Arial"/>
@@ -711,9 +711,9 @@
           <w:ilvl w:val="0"/>
           <w:numId w:val="2"/>
         </w:numPr>
-        <w:spacing w:after="24" w:line="228"/>
-      </w:pPr>
-      <w:hyperlink w:history="1" r:id="rIdahncslw-qz0hd2gg9v2xc">
+        <w:spacing w:after="20" w:line="222"/>
+      </w:pPr>
+      <w:hyperlink w:history="1" r:id="rIdzmjszbsn8vfgm0nuquthz">
         <w:r>
           <w:rPr>
             <w:rFonts w:ascii="Arial" w:cs="Arial" w:eastAsia="Arial" w:hAnsi="Arial"/>
@@ -742,9 +742,9 @@
           <w:ilvl w:val="0"/>
           <w:numId w:val="2"/>
         </w:numPr>
-        <w:spacing w:after="24" w:line="228"/>
-      </w:pPr>
-      <w:hyperlink w:history="1" r:id="rIdd4psv4dwgqunoos3rbybd">
+        <w:spacing w:after="20" w:line="222"/>
+      </w:pPr>
+      <w:hyperlink w:history="1" r:id="rId5wcblhuciwht-snasig1j">
         <w:r>
           <w:rPr>
             <w:rFonts w:ascii="Arial" w:cs="Arial" w:eastAsia="Arial" w:hAnsi="Arial"/>
@@ -773,9 +773,9 @@
           <w:ilvl w:val="0"/>
           <w:numId w:val="2"/>
         </w:numPr>
-        <w:spacing w:after="24" w:line="228"/>
-      </w:pPr>
-      <w:hyperlink w:history="1" r:id="rIdurvqkb7c8kpsox0mlj_zz">
+        <w:spacing w:after="20" w:line="222"/>
+      </w:pPr>
+      <w:hyperlink w:history="1" r:id="rIdqkaivk7mrxvqkr8dsrndk">
         <w:r>
           <w:rPr>
             <w:rFonts w:ascii="Arial" w:cs="Arial" w:eastAsia="Arial" w:hAnsi="Arial"/>
@@ -804,9 +804,9 @@
           <w:ilvl w:val="0"/>
           <w:numId w:val="2"/>
         </w:numPr>
-        <w:spacing w:after="24" w:line="228"/>
-      </w:pPr>
-      <w:hyperlink w:history="1" r:id="rId9lhsbmxykur7mpapfp8ma">
+        <w:spacing w:after="20" w:line="222"/>
+      </w:pPr>
+      <w:hyperlink w:history="1" r:id="rIdsi0ldm2q1hj92pmmjsrwp">
         <w:r>
           <w:rPr>
             <w:rFonts w:ascii="Arial" w:cs="Arial" w:eastAsia="Arial" w:hAnsi="Arial"/>
@@ -833,7 +833,7 @@
         <w:pBdr>
           <w:bottom w:val="single" w:color="C8CCD0" w:sz="4" w:space="2"/>
         </w:pBdr>
-        <w:spacing w:after="30" w:before="100" w:line="240"/>
+        <w:spacing w:after="24" w:before="80" w:line="236"/>
       </w:pPr>
       <w:r>
         <w:rPr>
@@ -843,12 +843,12 @@
           <w:sz w:val="20"/>
           <w:szCs w:val="20"/>
         </w:rPr>
-        <w:t xml:space="preserve">4. Where the lengths are stored on the instance</w:t>
-      </w:r>
-    </w:p>
-    <w:p>
-      <w:pPr>
-        <w:spacing w:after="40" w:before="0" w:line="228"/>
+        <w:t xml:space="preserve">4. Where the lengths are stored</w:t>
+      </w:r>
+    </w:p>
+    <w:p>
+      <w:pPr>
+        <w:spacing w:after="30" w:before="0" w:line="222"/>
       </w:pPr>
       <w:r>
         <w:rPr>
@@ -857,7 +857,25 @@
           <w:sz w:val="18"/>
           <w:szCs w:val="18"/>
         </w:rPr>
-        <w:t xml:space="preserve">Dictionary entries, table sys_dictionary. Open /sys_dictionary.do?sys_id=&lt;id&gt; on the instance to read the Max length figure.</w:t>
+        <w:t xml:space="preserve">Max length of the dictionary entry (sys_dictionary), not a property record. Open on any instance: </w:t>
+      </w:r>
+      <w:r>
+        <w:rPr>
+          <w:rFonts w:ascii="Consolas" w:cs="Consolas" w:eastAsia="Consolas" w:hAnsi="Consolas"/>
+          <w:color w:val="555555"/>
+          <w:sz w:val="16"/>
+          <w:szCs w:val="16"/>
+        </w:rPr>
+        <w:t xml:space="preserve">/sys_dictionary_list.do?sysparm_query=</w:t>
+      </w:r>
+      <w:r>
+        <w:rPr>
+          <w:rFonts w:ascii="Arial" w:cs="Arial" w:eastAsia="Arial" w:hAnsi="Arial"/>
+          <w:color w:val="555555"/>
+          <w:sz w:val="18"/>
+          <w:szCs w:val="18"/>
+        </w:rPr>
+        <w:t xml:space="preserve"> plus the query.</w:t>
       </w:r>
     </w:p>
     <w:tbl>
@@ -874,10 +892,10 @@
         <w:tblLayout w:type="fixed"/>
       </w:tblPr>
       <w:tblGrid>
-        <w:gridCol w:w="3100"/>
-        <w:gridCol w:w="1500"/>
-        <w:gridCol w:w="900"/>
-        <w:gridCol w:w="4500"/>
+        <w:gridCol w:w="2900"/>
+        <w:gridCol w:w="1400"/>
+        <w:gridCol w:w="850"/>
+        <w:gridCol w:w="4850"/>
       </w:tblGrid>
       <w:tr>
         <w:trPr>
@@ -885,7 +903,7 @@
         </w:trPr>
         <w:tc>
           <w:tcPr>
-            <w:tcW w:type="dxa" w:w="3100"/>
+            <w:tcW w:type="dxa" w:w="2900"/>
             <w:shd w:fill="E8EAED" w:val="clear"/>
             <w:tcMar>
               <w:top w:type="dxa" w:w="40"/>
@@ -912,7 +930,7 @@
         </w:tc>
         <w:tc>
           <w:tcPr>
-            <w:tcW w:type="dxa" w:w="1500"/>
+            <w:tcW w:type="dxa" w:w="1400"/>
             <w:shd w:fill="E8EAED" w:val="clear"/>
             <w:tcMar>
               <w:top w:type="dxa" w:w="40"/>
@@ -939,7 +957,7 @@
         </w:tc>
         <w:tc>
           <w:tcPr>
-            <w:tcW w:type="dxa" w:w="900"/>
+            <w:tcW w:type="dxa" w:w="850"/>
             <w:shd w:fill="E8EAED" w:val="clear"/>
             <w:tcMar>
               <w:top w:type="dxa" w:w="40"/>
@@ -966,7 +984,7 @@
         </w:tc>
         <w:tc>
           <w:tcPr>
-            <w:tcW w:type="dxa" w:w="4500"/>
+            <w:tcW w:type="dxa" w:w="4850"/>
             <w:shd w:fill="E8EAED" w:val="clear"/>
             <w:tcMar>
               <w:top w:type="dxa" w:w="40"/>
@@ -987,7 +1005,7 @@
                 <w:sz w:val="17"/>
                 <w:szCs w:val="17"/>
               </w:rPr>
-              <w:t xml:space="preserve">Dictionary record id</w:t>
+              <w:t xml:space="preserve">Dictionary entry (query)</w:t>
             </w:r>
           </w:p>
         </w:tc>
@@ -998,7 +1016,7 @@
         </w:trPr>
         <w:tc>
           <w:tcPr>
-            <w:tcW w:type="dxa" w:w="3100"/>
+            <w:tcW w:type="dxa" w:w="2900"/>
             <w:tcMar>
               <w:top w:type="dxa" w:w="40"/>
               <w:left w:type="dxa" w:w="80"/>
@@ -1024,7 +1042,7 @@
         </w:tc>
         <w:tc>
           <w:tcPr>
-            <w:tcW w:type="dxa" w:w="1500"/>
+            <w:tcW w:type="dxa" w:w="1400"/>
             <w:tcMar>
               <w:top w:type="dxa" w:w="40"/>
               <w:left w:type="dxa" w:w="80"/>
@@ -1050,7 +1068,7 @@
         </w:tc>
         <w:tc>
           <w:tcPr>
-            <w:tcW w:type="dxa" w:w="900"/>
+            <w:tcW w:type="dxa" w:w="850"/>
             <w:tcMar>
               <w:top w:type="dxa" w:w="40"/>
               <w:left w:type="dxa" w:w="80"/>
@@ -1076,7 +1094,7 @@
         </w:tc>
         <w:tc>
           <w:tcPr>
-            <w:tcW w:type="dxa" w:w="4500"/>
+            <w:tcW w:type="dxa" w:w="4850"/>
             <w:tcMar>
               <w:top w:type="dxa" w:w="40"/>
               <w:left w:type="dxa" w:w="80"/>
@@ -1096,7 +1114,7 @@
                 <w:sz w:val="17"/>
                 <w:szCs w:val="17"/>
               </w:rPr>
-              <w:t xml:space="preserve">4d84182cf50003100a22c0b3dfa15142</w:t>
+              <w:t xml:space="preserve">name=sys_rest_message_fn_param_defs^element=value</w:t>
             </w:r>
           </w:p>
         </w:tc>
@@ -1107,7 +1125,7 @@
         </w:trPr>
         <w:tc>
           <w:tcPr>
-            <w:tcW w:type="dxa" w:w="3100"/>
+            <w:tcW w:type="dxa" w:w="2900"/>
             <w:shd w:fill="F6F7F8" w:val="clear"/>
             <w:tcMar>
               <w:top w:type="dxa" w:w="40"/>
@@ -1134,7 +1152,7 @@
         </w:tc>
         <w:tc>
           <w:tcPr>
-            <w:tcW w:type="dxa" w:w="1500"/>
+            <w:tcW w:type="dxa" w:w="1400"/>
             <w:shd w:fill="F6F7F8" w:val="clear"/>
             <w:tcMar>
               <w:top w:type="dxa" w:w="40"/>
@@ -1161,7 +1179,7 @@
         </w:tc>
         <w:tc>
           <w:tcPr>
-            <w:tcW w:type="dxa" w:w="900"/>
+            <w:tcW w:type="dxa" w:w="850"/>
             <w:shd w:fill="F6F7F8" w:val="clear"/>
             <w:tcMar>
               <w:top w:type="dxa" w:w="40"/>
@@ -1188,7 +1206,7 @@
         </w:tc>
         <w:tc>
           <w:tcPr>
-            <w:tcW w:type="dxa" w:w="4500"/>
+            <w:tcW w:type="dxa" w:w="4850"/>
             <w:shd w:fill="F6F7F8" w:val="clear"/>
             <w:tcMar>
               <w:top w:type="dxa" w:w="40"/>
@@ -1209,7 +1227,7 @@
                 <w:sz w:val="17"/>
                 <w:szCs w:val="17"/>
               </w:rPr>
-              <w:t xml:space="preserve">dd84182cf50003100a22c0b3dfa1519a</w:t>
+              <w:t xml:space="preserve">name=sys_rest_message_fn_parameters^element=value</w:t>
             </w:r>
           </w:p>
         </w:tc>
@@ -1220,7 +1238,7 @@
         </w:trPr>
         <w:tc>
           <w:tcPr>
-            <w:tcW w:type="dxa" w:w="3100"/>
+            <w:tcW w:type="dxa" w:w="2900"/>
             <w:tcMar>
               <w:top w:type="dxa" w:w="40"/>
               <w:left w:type="dxa" w:w="80"/>
@@ -1246,7 +1264,7 @@
         </w:tc>
         <w:tc>
           <w:tcPr>
-            <w:tcW w:type="dxa" w:w="1500"/>
+            <w:tcW w:type="dxa" w:w="1400"/>
             <w:tcMar>
               <w:top w:type="dxa" w:w="40"/>
               <w:left w:type="dxa" w:w="80"/>
@@ -1272,7 +1290,7 @@
         </w:tc>
         <w:tc>
           <w:tcPr>
-            <w:tcW w:type="dxa" w:w="900"/>
+            <w:tcW w:type="dxa" w:w="850"/>
             <w:tcMar>
               <w:top w:type="dxa" w:w="40"/>
               <w:left w:type="dxa" w:w="80"/>
@@ -1298,7 +1316,7 @@
         </w:tc>
         <w:tc>
           <w:tcPr>
-            <w:tcW w:type="dxa" w:w="4500"/>
+            <w:tcW w:type="dxa" w:w="4850"/>
             <w:tcMar>
               <w:top w:type="dxa" w:w="40"/>
               <w:left w:type="dxa" w:w="80"/>
@@ -1318,7 +1336,7 @@
                 <w:sz w:val="17"/>
                 <w:szCs w:val="17"/>
               </w:rPr>
-              <w:t xml:space="preserve">7084d42cf50003100a22c0b3dfa1518f</w:t>
+              <w:t xml:space="preserve">name=sys_rest_message_fn^element=rest_endpoint</w:t>
             </w:r>
           </w:p>
         </w:tc>
@@ -1329,7 +1347,7 @@
         </w:trPr>
         <w:tc>
           <w:tcPr>
-            <w:tcW w:type="dxa" w:w="3100"/>
+            <w:tcW w:type="dxa" w:w="2900"/>
             <w:shd w:fill="F6F7F8" w:val="clear"/>
             <w:tcMar>
               <w:top w:type="dxa" w:w="40"/>
@@ -1356,7 +1374,7 @@
         </w:tc>
         <w:tc>
           <w:tcPr>
-            <w:tcW w:type="dxa" w:w="1500"/>
+            <w:tcW w:type="dxa" w:w="1400"/>
             <w:shd w:fill="F6F7F8" w:val="clear"/>
             <w:tcMar>
               <w:top w:type="dxa" w:w="40"/>
@@ -1383,7 +1401,7 @@
         </w:tc>
         <w:tc>
           <w:tcPr>
-            <w:tcW w:type="dxa" w:w="900"/>
+            <w:tcW w:type="dxa" w:w="850"/>
             <w:shd w:fill="F6F7F8" w:val="clear"/>
             <w:tcMar>
               <w:top w:type="dxa" w:w="40"/>
@@ -1410,7 +1428,7 @@
         </w:tc>
         <w:tc>
           <w:tcPr>
-            <w:tcW w:type="dxa" w:w="4500"/>
+            <w:tcW w:type="dxa" w:w="4850"/>
             <w:shd w:fill="F6F7F8" w:val="clear"/>
             <w:tcMar>
               <w:top w:type="dxa" w:w="40"/>
@@ -1431,7 +1449,7 @@
                 <w:sz w:val="17"/>
                 <w:szCs w:val="17"/>
               </w:rPr>
-              <w:t xml:space="preserve">1b9d2390934e4710e3aef0aefaba1029</w:t>
+              <w:t xml:space="preserve">name=sn_sec_int_impl_config^element=value</w:t>
             </w:r>
           </w:p>
         </w:tc>
@@ -1442,7 +1460,7 @@
         </w:trPr>
         <w:tc>
           <w:tcPr>
-            <w:tcW w:type="dxa" w:w="3100"/>
+            <w:tcW w:type="dxa" w:w="2900"/>
             <w:tcMar>
               <w:top w:type="dxa" w:w="40"/>
               <w:left w:type="dxa" w:w="80"/>
@@ -1468,7 +1486,7 @@
         </w:tc>
         <w:tc>
           <w:tcPr>
-            <w:tcW w:type="dxa" w:w="1500"/>
+            <w:tcW w:type="dxa" w:w="1400"/>
             <w:tcMar>
               <w:top w:type="dxa" w:w="40"/>
               <w:left w:type="dxa" w:w="80"/>
@@ -1494,7 +1512,7 @@
         </w:tc>
         <w:tc>
           <w:tcPr>
-            <w:tcW w:type="dxa" w:w="900"/>
+            <w:tcW w:type="dxa" w:w="850"/>
             <w:tcMar>
               <w:top w:type="dxa" w:w="40"/>
               <w:left w:type="dxa" w:w="80"/>
@@ -1520,7 +1538,7 @@
         </w:tc>
         <w:tc>
           <w:tcPr>
-            <w:tcW w:type="dxa" w:w="4500"/>
+            <w:tcW w:type="dxa" w:w="4850"/>
             <w:tcMar>
               <w:top w:type="dxa" w:w="40"/>
               <w:left w:type="dxa" w:w="80"/>
@@ -1540,7 +1558,7 @@
                 <w:sz w:val="17"/>
                 <w:szCs w:val="17"/>
               </w:rPr>
-              <w:t xml:space="preserve">31931420f50003100a22c0b3dfa151f8</w:t>
+              <w:t xml:space="preserve">name=sys_properties^element=value</w:t>
             </w:r>
           </w:p>
         </w:tc>
@@ -1551,7 +1569,7 @@
         <w:pBdr>
           <w:bottom w:val="single" w:color="C8CCD0" w:sz="4" w:space="2"/>
         </w:pBdr>
-        <w:spacing w:after="30" w:before="100" w:line="240"/>
+        <w:spacing w:after="24" w:before="80" w:line="236"/>
       </w:pPr>
       <w:r>
         <w:rPr>
@@ -1566,7 +1584,7 @@
     </w:p>
     <w:p>
       <w:pPr>
-        <w:spacing w:after="0" w:before="0" w:line="228"/>
+        <w:spacing w:after="0" w:before="0" w:line="222"/>
       </w:pPr>
       <w:r>
         <w:rPr>
@@ -1581,7 +1599,7 @@
     </w:p>
     <w:sectPr>
       <w:pgSz w:w="11906" w:h="16838" w:orient="portrait"/>
-      <w:pgMar w:top="600" w:right="680" w:bottom="560" w:left="680" w:header="708" w:footer="708" w:gutter="0"/>
+      <w:pgMar w:top="500" w:right="680" w:bottom="460" w:left="680" w:header="708" w:footer="708" w:gutter="0"/>
       <w:pgNumType/>
       <w:docGrid w:linePitch="360"/>
     </w:sectPr>

</xml_diff>